<commit_message>
complete bulletin privacy notice
Co-authored-by: Claude Opus 5.5 <noreply@anthropic.com>
</commit_message>
<xml_diff>
--- a/public/bulletin_adhesion.docx
+++ b/public/bulletin_adhesion.docx
@@ -294,32 +294,233 @@
     </w:p>
     <w:p>
       <w:pPr>
-        <w:jc w:val="both"/>
-        <w:rPr>
-          <w:rFonts w:ascii="Arial" w:cs="Arial" w:eastAsia="Arial" w:hAnsi="Arial"/>
-        </w:rPr>
-      </w:pPr>
-      <w:r>
-        <w:rPr>
-          <w:rFonts w:ascii="Arial" w:cs="Arial" w:eastAsia="Arial" w:hAnsi="Arial"/>
-          <w:rtl w:val="0"/>
-        </w:rPr>
-        <w:t xml:space="preserve">Les informations recueillies sont nécessaires à la gestion de l’adhésion.</w:t>
-      </w:r>
-    </w:p>
-    <w:p>
-      <w:pPr>
-        <w:jc w:val="both"/>
-        <w:rPr>
-          <w:rFonts w:ascii="Arial" w:cs="Arial" w:eastAsia="Arial" w:hAnsi="Arial"/>
-        </w:rPr>
-      </w:pPr>
-      <w:r>
-        <w:rPr>
-          <w:rFonts w:ascii="Arial" w:cs="Arial" w:eastAsia="Arial" w:hAnsi="Arial"/>
-          <w:rtl w:val="0"/>
-        </w:rPr>
-        <w:t xml:space="preserve">Elles sont destinées exclusivement à l’association Bluegenji Esport et ne seront pas cédées à des tiers.</w:t>
+        <w:spacing w:after="0" w:before="0"/>
+        <w:jc w:val="both"/>
+        <w:rPr>
+          <w:rFonts w:ascii="Arial" w:cs="Arial" w:eastAsia="Arial" w:hAnsi="Arial"/>
+          <w:sz w:val="16"/>
+          <w:szCs w:val="16"/>
+        </w:rPr>
+      </w:pPr>
+      <w:r>
+        <w:rPr>
+          <w:rFonts w:ascii="Arial" w:cs="Arial" w:eastAsia="Arial" w:hAnsi="Arial"/>
+          <w:b w:val="1"/>
+          <w:sz w:val="16"/>
+          <w:szCs w:val="16"/>
+          <w:rtl w:val="0"/>
+        </w:rPr>
+        <w:t xml:space="preserve">Information sur vos données personnelles (article 13 du RGPD)</w:t>
+      </w:r>
+    </w:p>
+    <w:p>
+      <w:pPr>
+        <w:spacing w:after="0" w:before="0"/>
+        <w:jc w:val="both"/>
+        <w:rPr>
+          <w:rFonts w:ascii="Arial" w:cs="Arial" w:eastAsia="Arial" w:hAnsi="Arial"/>
+          <w:sz w:val="16"/>
+          <w:szCs w:val="16"/>
+        </w:rPr>
+      </w:pPr>
+      <w:r>
+        <w:rPr>
+          <w:rFonts w:ascii="Arial" w:cs="Arial" w:eastAsia="Arial" w:hAnsi="Arial"/>
+          <w:b w:val="1"/>
+          <w:sz w:val="16"/>
+          <w:szCs w:val="16"/>
+          <w:rtl w:val="0"/>
+        </w:rPr>
+        <w:t xml:space="preserve">Responsable du traitement : </w:t>
+      </w:r>
+      <w:r>
+        <w:rPr>
+          <w:rFonts w:ascii="Arial" w:cs="Arial" w:eastAsia="Arial" w:hAnsi="Arial"/>
+          <w:sz w:val="16"/>
+          <w:szCs w:val="16"/>
+          <w:rtl w:val="0"/>
+        </w:rPr>
+        <w:t xml:space="preserve">l’association Bluegenji Esport, 4 impasse des Cyprès, 51210 Janvilliers. Pour la contacter, utilisez les moyens indiqués sur la page https://bluegenji-esport.fr/mentions-legales.</w:t>
+      </w:r>
+    </w:p>
+    <w:p>
+      <w:pPr>
+        <w:spacing w:after="0" w:before="0"/>
+        <w:jc w:val="both"/>
+        <w:rPr>
+          <w:rFonts w:ascii="Arial" w:cs="Arial" w:eastAsia="Arial" w:hAnsi="Arial"/>
+          <w:sz w:val="16"/>
+          <w:szCs w:val="16"/>
+        </w:rPr>
+      </w:pPr>
+      <w:r>
+        <w:rPr>
+          <w:rFonts w:ascii="Arial" w:cs="Arial" w:eastAsia="Arial" w:hAnsi="Arial"/>
+          <w:b w:val="1"/>
+          <w:sz w:val="16"/>
+          <w:szCs w:val="16"/>
+          <w:rtl w:val="0"/>
+        </w:rPr>
+        <w:t xml:space="preserve">Finalité : </w:t>
+      </w:r>
+      <w:r>
+        <w:rPr>
+          <w:rFonts w:ascii="Arial" w:cs="Arial" w:eastAsia="Arial" w:hAnsi="Arial"/>
+          <w:sz w:val="16"/>
+          <w:szCs w:val="16"/>
+          <w:rtl w:val="0"/>
+        </w:rPr>
+        <w:t xml:space="preserve">gestion de votre adhésion (enregistrement, agrément par le Bureau, suivi de la cotisation et de la qualité de membre, vérification de l’âge et, pour un mineur, de l’accord de son représentant légal).</w:t>
+      </w:r>
+    </w:p>
+    <w:p>
+      <w:pPr>
+        <w:spacing w:after="0" w:before="0"/>
+        <w:jc w:val="both"/>
+        <w:rPr>
+          <w:rFonts w:ascii="Arial" w:cs="Arial" w:eastAsia="Arial" w:hAnsi="Arial"/>
+          <w:sz w:val="16"/>
+          <w:szCs w:val="16"/>
+        </w:rPr>
+      </w:pPr>
+      <w:r>
+        <w:rPr>
+          <w:rFonts w:ascii="Arial" w:cs="Arial" w:eastAsia="Arial" w:hAnsi="Arial"/>
+          <w:b w:val="1"/>
+          <w:sz w:val="16"/>
+          <w:szCs w:val="16"/>
+          <w:rtl w:val="0"/>
+        </w:rPr>
+        <w:t xml:space="preserve">Base légale : </w:t>
+      </w:r>
+      <w:r>
+        <w:rPr>
+          <w:rFonts w:ascii="Arial" w:cs="Arial" w:eastAsia="Arial" w:hAnsi="Arial"/>
+          <w:sz w:val="16"/>
+          <w:szCs w:val="16"/>
+          <w:rtl w:val="0"/>
+        </w:rPr>
+        <w:t xml:space="preserve">l’exécution du contrat d’adhésion que vous concluez avec l’association (article 6.1.b du RGPD). Les informations demandées sont nécessaires à l’examen de votre demande, sauf le tag Discord, facultatif.</w:t>
+      </w:r>
+    </w:p>
+    <w:p>
+      <w:pPr>
+        <w:spacing w:after="0" w:before="0"/>
+        <w:jc w:val="both"/>
+        <w:rPr>
+          <w:rFonts w:ascii="Arial" w:cs="Arial" w:eastAsia="Arial" w:hAnsi="Arial"/>
+          <w:sz w:val="16"/>
+          <w:szCs w:val="16"/>
+        </w:rPr>
+      </w:pPr>
+      <w:r>
+        <w:rPr>
+          <w:rFonts w:ascii="Arial" w:cs="Arial" w:eastAsia="Arial" w:hAnsi="Arial"/>
+          <w:b w:val="1"/>
+          <w:sz w:val="16"/>
+          <w:szCs w:val="16"/>
+          <w:rtl w:val="0"/>
+        </w:rPr>
+        <w:t xml:space="preserve">Destinataires : </w:t>
+      </w:r>
+      <w:r>
+        <w:rPr>
+          <w:rFonts w:ascii="Arial" w:cs="Arial" w:eastAsia="Arial" w:hAnsi="Arial"/>
+          <w:sz w:val="16"/>
+          <w:szCs w:val="16"/>
+          <w:rtl w:val="0"/>
+        </w:rPr>
+        <w:t xml:space="preserve">les membres du Bureau de l’association. Lorsqu’une cotisation est réglée par PayPal, PayPal traite les données de paiement pour son propre compte. Vos données ne sont ni vendues ni cédées à des tiers.</w:t>
+      </w:r>
+    </w:p>
+    <w:p>
+      <w:pPr>
+        <w:spacing w:after="0" w:before="0"/>
+        <w:jc w:val="both"/>
+        <w:rPr>
+          <w:rFonts w:ascii="Arial" w:cs="Arial" w:eastAsia="Arial" w:hAnsi="Arial"/>
+          <w:sz w:val="16"/>
+          <w:szCs w:val="16"/>
+        </w:rPr>
+      </w:pPr>
+      <w:r>
+        <w:rPr>
+          <w:rFonts w:ascii="Arial" w:cs="Arial" w:eastAsia="Arial" w:hAnsi="Arial"/>
+          <w:b w:val="1"/>
+          <w:sz w:val="16"/>
+          <w:szCs w:val="16"/>
+          <w:rtl w:val="0"/>
+        </w:rPr>
+        <w:t xml:space="preserve">Durée de conservation : </w:t>
+      </w:r>
+      <w:r>
+        <w:rPr>
+          <w:rFonts w:ascii="Arial" w:cs="Arial" w:eastAsia="Arial" w:hAnsi="Arial"/>
+          <w:sz w:val="16"/>
+          <w:szCs w:val="16"/>
+          <w:rtl w:val="0"/>
+        </w:rPr>
+        <w:t xml:space="preserve">[décision requise : durée à fixer par le Bureau].</w:t>
+      </w:r>
+    </w:p>
+    <w:p>
+      <w:pPr>
+        <w:spacing w:after="0" w:before="0"/>
+        <w:jc w:val="both"/>
+        <w:rPr>
+          <w:rFonts w:ascii="Arial" w:cs="Arial" w:eastAsia="Arial" w:hAnsi="Arial"/>
+          <w:sz w:val="16"/>
+          <w:szCs w:val="16"/>
+        </w:rPr>
+      </w:pPr>
+      <w:r>
+        <w:rPr>
+          <w:rFonts w:ascii="Arial" w:cs="Arial" w:eastAsia="Arial" w:hAnsi="Arial"/>
+          <w:b w:val="1"/>
+          <w:sz w:val="16"/>
+          <w:szCs w:val="16"/>
+          <w:rtl w:val="0"/>
+        </w:rPr>
+        <w:t xml:space="preserve">Vos droits : </w:t>
+      </w:r>
+      <w:r>
+        <w:rPr>
+          <w:rFonts w:ascii="Arial" w:cs="Arial" w:eastAsia="Arial" w:hAnsi="Arial"/>
+          <w:sz w:val="16"/>
+          <w:szCs w:val="16"/>
+          <w:rtl w:val="0"/>
+        </w:rPr>
+        <w:t xml:space="preserve">vous disposez d’un droit d’accès, de rectification, d’effacement, de limitation, d’opposition et à la portabilité de vos données. Pour les exercer, et pour en savoir plus, consultez la politique de confidentialité : https://bluegenji-esport.fr/rgpd.</w:t>
+      </w:r>
+    </w:p>
+    <w:p>
+      <w:pPr>
+        <w:spacing w:after="0" w:before="0"/>
+        <w:jc w:val="both"/>
+        <w:rPr>
+          <w:rFonts w:ascii="Arial" w:cs="Arial" w:eastAsia="Arial" w:hAnsi="Arial"/>
+          <w:sz w:val="16"/>
+          <w:szCs w:val="16"/>
+        </w:rPr>
+      </w:pPr>
+      <w:r>
+        <w:rPr>
+          <w:rFonts w:ascii="Arial" w:cs="Arial" w:eastAsia="Arial" w:hAnsi="Arial"/>
+          <w:b w:val="1"/>
+          <w:sz w:val="16"/>
+          <w:szCs w:val="16"/>
+          <w:rtl w:val="0"/>
+        </w:rPr>
+        <w:t xml:space="preserve">Réclamation : </w:t>
+      </w:r>
+      <w:r>
+        <w:rPr>
+          <w:rFonts w:ascii="Arial" w:cs="Arial" w:eastAsia="Arial" w:hAnsi="Arial"/>
+          <w:sz w:val="16"/>
+          <w:szCs w:val="16"/>
+          <w:rtl w:val="0"/>
+        </w:rPr>
+        <w:t xml:space="preserve">vous pouvez introduire une réclamation auprès de la CNIL (www.cnil.fr).</w:t>
       </w:r>
     </w:p>
     <w:p>

</xml_diff>

<commit_message>
repeat notice in member copy
Co-authored-by: Claude Opus 5.5 <noreply@anthropic.com>
</commit_message>
<xml_diff>
--- a/public/bulletin_adhesion.docx
+++ b/public/bulletin_adhesion.docx
@@ -836,6 +836,36 @@
         <w:rPr>
           <w:rtl w:val="0"/>
         </w:rPr>
+      </w:r>
+    </w:p>
+    <w:p>
+      <w:pPr>
+        <w:spacing w:after="0" w:before="0"/>
+        <w:jc w:val="both"/>
+        <w:rPr>
+          <w:rFonts w:ascii="Arial" w:cs="Arial" w:eastAsia="Arial" w:hAnsi="Arial"/>
+          <w:sz w:val="16"/>
+          <w:szCs w:val="16"/>
+        </w:rPr>
+      </w:pPr>
+      <w:r>
+        <w:rPr>
+          <w:rFonts w:ascii="Arial" w:cs="Arial" w:eastAsia="Arial" w:hAnsi="Arial"/>
+          <w:b w:val="1"/>
+          <w:sz w:val="16"/>
+          <w:szCs w:val="16"/>
+          <w:rtl w:val="0"/>
+        </w:rPr>
+        <w:t xml:space="preserve">Vos données personnelles : </w:t>
+      </w:r>
+      <w:r>
+        <w:rPr>
+          <w:rFonts w:ascii="Arial" w:cs="Arial" w:eastAsia="Arial" w:hAnsi="Arial"/>
+          <w:sz w:val="16"/>
+          <w:szCs w:val="16"/>
+          <w:rtl w:val="0"/>
+        </w:rPr>
+        <w:t xml:space="preserve">responsable du traitement Bluegenji Esport, 4 impasse des Cyprès, 51210 Janvilliers (contact : https://bluegenji-esport.fr/mentions-legales). Droits d’accès, de rectification, d’effacement, de limitation et à la portabilité : https://bluegenji-esport.fr/rgpd. Réclamation auprès de la CNIL (www.cnil.fr).</w:t>
       </w:r>
     </w:p>
     <w:p>

</xml_diff>